<commit_message>
add: add screenshots to readme
</commit_message>
<xml_diff>
--- a/README.docx
+++ b/README.docx
@@ -1451,7 +1451,23 @@
           <w:sz w:val="18"/>
           <w:szCs w:val="18"/>
         </w:rPr>
-        <w:t>main.cpp               Mã nguồn chương trình</w:t>
+        <w:t>main.cpp               Mã ngu</w:t>
+      </w:r>
+      <w:r>
+        <w:rPr>
+          <w:rFonts w:ascii="Consolas" w:eastAsia="Consolas" w:hAnsi="Consolas" w:cs="Consolas"/>
+          <w:sz w:val="18"/>
+          <w:szCs w:val="18"/>
+        </w:rPr>
+        <w:t>ồ</w:t>
+      </w:r>
+      <w:r>
+        <w:rPr>
+          <w:rFonts w:ascii="Consolas" w:eastAsia="Consolas" w:hAnsi="Consolas" w:cs="Consolas"/>
+          <w:sz w:val="18"/>
+          <w:szCs w:val="18"/>
+        </w:rPr>
+        <w:t>n chương trình</w:t>
       </w:r>
     </w:p>
     <w:p>
@@ -1468,7 +1484,55 @@
           <w:sz w:val="18"/>
           <w:szCs w:val="18"/>
         </w:rPr>
-        <w:t>patientList.txt        Dữ liệu bệnh nhân</w:t>
+        <w:t>patientList.txt        D</w:t>
+      </w:r>
+      <w:r>
+        <w:rPr>
+          <w:rFonts w:ascii="Consolas" w:eastAsia="Consolas" w:hAnsi="Consolas" w:cs="Consolas"/>
+          <w:sz w:val="18"/>
+          <w:szCs w:val="18"/>
+        </w:rPr>
+        <w:t>ữ</w:t>
+      </w:r>
+      <w:r>
+        <w:rPr>
+          <w:rFonts w:ascii="Consolas" w:eastAsia="Consolas" w:hAnsi="Consolas" w:cs="Consolas"/>
+          <w:sz w:val="18"/>
+          <w:szCs w:val="18"/>
+        </w:rPr>
+        <w:t xml:space="preserve"> li</w:t>
+      </w:r>
+      <w:r>
+        <w:rPr>
+          <w:rFonts w:ascii="Consolas" w:eastAsia="Consolas" w:hAnsi="Consolas" w:cs="Consolas"/>
+          <w:sz w:val="18"/>
+          <w:szCs w:val="18"/>
+        </w:rPr>
+        <w:t>ệ</w:t>
+      </w:r>
+      <w:r>
+        <w:rPr>
+          <w:rFonts w:ascii="Consolas" w:eastAsia="Consolas" w:hAnsi="Consolas" w:cs="Consolas"/>
+          <w:sz w:val="18"/>
+          <w:szCs w:val="18"/>
+        </w:rPr>
+        <w:t>u b</w:t>
+      </w:r>
+      <w:r>
+        <w:rPr>
+          <w:rFonts w:ascii="Consolas" w:eastAsia="Consolas" w:hAnsi="Consolas" w:cs="Consolas"/>
+          <w:sz w:val="18"/>
+          <w:szCs w:val="18"/>
+        </w:rPr>
+        <w:t>ệ</w:t>
+      </w:r>
+      <w:r>
+        <w:rPr>
+          <w:rFonts w:ascii="Consolas" w:eastAsia="Consolas" w:hAnsi="Consolas" w:cs="Consolas"/>
+          <w:sz w:val="18"/>
+          <w:szCs w:val="18"/>
+        </w:rPr>
+        <w:t>nh nhân</w:t>
       </w:r>
     </w:p>
     <w:p>
@@ -1485,7 +1549,23 @@
           <w:sz w:val="18"/>
           <w:szCs w:val="18"/>
         </w:rPr>
-        <w:t>README.docx            Tài liệu này</w:t>
+        <w:t>README.docx            Tài li</w:t>
+      </w:r>
+      <w:r>
+        <w:rPr>
+          <w:rFonts w:ascii="Consolas" w:eastAsia="Consolas" w:hAnsi="Consolas" w:cs="Consolas"/>
+          <w:sz w:val="18"/>
+          <w:szCs w:val="18"/>
+        </w:rPr>
+        <w:t>ệ</w:t>
+      </w:r>
+      <w:r>
+        <w:rPr>
+          <w:rFonts w:ascii="Consolas" w:eastAsia="Consolas" w:hAnsi="Consolas" w:cs="Consolas"/>
+          <w:sz w:val="18"/>
+          <w:szCs w:val="18"/>
+        </w:rPr>
+        <w:t>u này</w:t>
       </w:r>
     </w:p>
     <w:p>
@@ -2428,12 +2508,49 @@
       </w:pPr>
       <w:r>
         <w:rPr>
-          <w:i/>
-          <w:iCs/>
-          <w:sz w:val="24"/>
-          <w:szCs w:val="24"/>
-        </w:rPr>
-        <w:t>[Chèn ảnh chụp màn hình: menu.png]</w:t>
+          <w:noProof/>
+        </w:rPr>
+        <w:drawing>
+          <wp:inline distT="0" distB="0" distL="0" distR="0" wp14:anchorId="3D091854" wp14:editId="1DD08E49">
+            <wp:extent cx="5162815" cy="2635385"/>
+            <wp:effectExtent l="0" t="0" r="0" b="0"/>
+            <wp:docPr id="2027817692" name="Picture 1"/>
+            <wp:cNvGraphicFramePr>
+              <a:graphicFrameLocks xmlns:a="http://schemas.openxmlformats.org/drawingml/2006/main" noChangeAspect="1"/>
+            </wp:cNvGraphicFramePr>
+            <a:graphic xmlns:a="http://schemas.openxmlformats.org/drawingml/2006/main">
+              <a:graphicData uri="http://schemas.openxmlformats.org/drawingml/2006/picture">
+                <pic:pic xmlns:pic="http://schemas.openxmlformats.org/drawingml/2006/picture">
+                  <pic:nvPicPr>
+                    <pic:cNvPr id="2027817692" name="Picture 2027817692"/>
+                    <pic:cNvPicPr/>
+                  </pic:nvPicPr>
+                  <pic:blipFill>
+                    <a:blip r:embed="rId7">
+                      <a:extLst>
+                        <a:ext uri="{28A0092B-C50C-407E-A947-70E740481C1C}">
+                          <a14:useLocalDpi xmlns:a14="http://schemas.microsoft.com/office/drawing/2010/main" val="0"/>
+                        </a:ext>
+                      </a:extLst>
+                    </a:blip>
+                    <a:stretch>
+                      <a:fillRect/>
+                    </a:stretch>
+                  </pic:blipFill>
+                  <pic:spPr>
+                    <a:xfrm>
+                      <a:off x="0" y="0"/>
+                      <a:ext cx="5162815" cy="2635385"/>
+                    </a:xfrm>
+                    <a:prstGeom prst="rect">
+                      <a:avLst/>
+                    </a:prstGeom>
+                  </pic:spPr>
+                </pic:pic>
+              </a:graphicData>
+            </a:graphic>
+          </wp:inline>
+        </w:drawing>
       </w:r>
     </w:p>
     <w:p>
@@ -2446,34 +2563,60 @@
         <w:pStyle w:val="Heading2"/>
       </w:pPr>
       <w:r>
+        <w:lastRenderedPageBreak/>
         <w:t>4.2. Xem danh sách bệnh nhân</w:t>
       </w:r>
     </w:p>
     <w:p>
       <w:pPr>
-        <w:pBdr>
-          <w:top w:val="single" w:sz="4" w:space="0" w:color="000000"/>
-          <w:left w:val="single" w:sz="4" w:space="0" w:color="000000"/>
-          <w:bottom w:val="single" w:sz="4" w:space="0" w:color="000000"/>
-          <w:right w:val="single" w:sz="4" w:space="0" w:color="000000"/>
-        </w:pBdr>
-        <w:spacing w:before="120" w:after="120"/>
-        <w:jc w:val="center"/>
-      </w:pPr>
-      <w:r>
-        <w:rPr>
-          <w:i/>
-          <w:iCs/>
-          <w:sz w:val="24"/>
-          <w:szCs w:val="24"/>
-        </w:rPr>
-        <w:t>[Chèn ảnh chụp màn hình: danh-sach.png]</w:t>
-      </w:r>
-    </w:p>
-    <w:p>
-      <w:pPr>
         <w:spacing w:after="240"/>
       </w:pPr>
+      <w:r>
+        <w:rPr>
+          <w:noProof/>
+        </w:rPr>
+        <w:drawing>
+          <wp:inline distT="0" distB="0" distL="0" distR="0" wp14:anchorId="2A356E59" wp14:editId="03E87614">
+            <wp:extent cx="6120130" cy="2655570"/>
+            <wp:effectExtent l="0" t="0" r="0" b="0"/>
+            <wp:docPr id="1511660644" name="Picture 2"/>
+            <wp:cNvGraphicFramePr>
+              <a:graphicFrameLocks xmlns:a="http://schemas.openxmlformats.org/drawingml/2006/main" noChangeAspect="1"/>
+            </wp:cNvGraphicFramePr>
+            <a:graphic xmlns:a="http://schemas.openxmlformats.org/drawingml/2006/main">
+              <a:graphicData uri="http://schemas.openxmlformats.org/drawingml/2006/picture">
+                <pic:pic xmlns:pic="http://schemas.openxmlformats.org/drawingml/2006/picture">
+                  <pic:nvPicPr>
+                    <pic:cNvPr id="1511660644" name="Picture 1511660644"/>
+                    <pic:cNvPicPr/>
+                  </pic:nvPicPr>
+                  <pic:blipFill>
+                    <a:blip r:embed="rId8">
+                      <a:extLst>
+                        <a:ext uri="{28A0092B-C50C-407E-A947-70E740481C1C}">
+                          <a14:useLocalDpi xmlns:a14="http://schemas.microsoft.com/office/drawing/2010/main" val="0"/>
+                        </a:ext>
+                      </a:extLst>
+                    </a:blip>
+                    <a:stretch>
+                      <a:fillRect/>
+                    </a:stretch>
+                  </pic:blipFill>
+                  <pic:spPr>
+                    <a:xfrm>
+                      <a:off x="0" y="0"/>
+                      <a:ext cx="6120130" cy="2655570"/>
+                    </a:xfrm>
+                    <a:prstGeom prst="rect">
+                      <a:avLst/>
+                    </a:prstGeom>
+                  </pic:spPr>
+                </pic:pic>
+              </a:graphicData>
+            </a:graphic>
+          </wp:inline>
+        </w:drawing>
+      </w:r>
     </w:p>
     <w:p>
       <w:pPr>
@@ -2485,33 +2628,120 @@
     </w:p>
     <w:p>
       <w:pPr>
-        <w:pBdr>
-          <w:top w:val="single" w:sz="4" w:space="0" w:color="000000"/>
-          <w:left w:val="single" w:sz="4" w:space="0" w:color="000000"/>
-          <w:bottom w:val="single" w:sz="4" w:space="0" w:color="000000"/>
-          <w:right w:val="single" w:sz="4" w:space="0" w:color="000000"/>
-        </w:pBdr>
-        <w:spacing w:before="120" w:after="120"/>
-        <w:jc w:val="center"/>
-      </w:pPr>
-      <w:r>
-        <w:rPr>
-          <w:i/>
-          <w:iCs/>
-          <w:sz w:val="24"/>
-          <w:szCs w:val="24"/>
-        </w:rPr>
-        <w:t>[Chèn ảnh chụp màn hình: them-benh-nhan.png]</w:t>
-      </w:r>
-    </w:p>
-    <w:p>
-      <w:pPr>
         <w:spacing w:after="240"/>
-      </w:pPr>
+        <w:rPr>
+          <w:lang w:val="vi-VN"/>
+        </w:rPr>
+      </w:pPr>
+      <w:r>
+        <w:rPr>
+          <w:noProof/>
+        </w:rPr>
+        <w:drawing>
+          <wp:inline distT="0" distB="0" distL="0" distR="0" wp14:anchorId="3C8AA42D" wp14:editId="168BED81">
+            <wp:extent cx="4359349" cy="4260593"/>
+            <wp:effectExtent l="0" t="0" r="3175" b="6985"/>
+            <wp:docPr id="1248505581" name="Picture 3"/>
+            <wp:cNvGraphicFramePr>
+              <a:graphicFrameLocks xmlns:a="http://schemas.openxmlformats.org/drawingml/2006/main" noChangeAspect="1"/>
+            </wp:cNvGraphicFramePr>
+            <a:graphic xmlns:a="http://schemas.openxmlformats.org/drawingml/2006/main">
+              <a:graphicData uri="http://schemas.openxmlformats.org/drawingml/2006/picture">
+                <pic:pic xmlns:pic="http://schemas.openxmlformats.org/drawingml/2006/picture">
+                  <pic:nvPicPr>
+                    <pic:cNvPr id="1248505581" name="Picture 1248505581"/>
+                    <pic:cNvPicPr/>
+                  </pic:nvPicPr>
+                  <pic:blipFill>
+                    <a:blip r:embed="rId9">
+                      <a:extLst>
+                        <a:ext uri="{28A0092B-C50C-407E-A947-70E740481C1C}">
+                          <a14:useLocalDpi xmlns:a14="http://schemas.microsoft.com/office/drawing/2010/main" val="0"/>
+                        </a:ext>
+                      </a:extLst>
+                    </a:blip>
+                    <a:stretch>
+                      <a:fillRect/>
+                    </a:stretch>
+                  </pic:blipFill>
+                  <pic:spPr>
+                    <a:xfrm>
+                      <a:off x="0" y="0"/>
+                      <a:ext cx="4374415" cy="4275317"/>
+                    </a:xfrm>
+                    <a:prstGeom prst="rect">
+                      <a:avLst/>
+                    </a:prstGeom>
+                  </pic:spPr>
+                </pic:pic>
+              </a:graphicData>
+            </a:graphic>
+          </wp:inline>
+        </w:drawing>
+      </w:r>
+    </w:p>
+    <w:p>
+      <w:pPr>
+        <w:spacing w:after="240"/>
+        <w:rPr>
+          <w:lang w:val="vi-VN"/>
+        </w:rPr>
+      </w:pPr>
+      <w:r>
+        <w:rPr>
+          <w:noProof/>
+          <w:lang w:val="vi-VN"/>
+        </w:rPr>
+        <w:lastRenderedPageBreak/>
+        <w:drawing>
+          <wp:inline distT="0" distB="0" distL="0" distR="0" wp14:anchorId="72638DE7" wp14:editId="3CFECD79">
+            <wp:extent cx="6120130" cy="2874645"/>
+            <wp:effectExtent l="0" t="0" r="0" b="1905"/>
+            <wp:docPr id="854151152" name="Picture 5"/>
+            <wp:cNvGraphicFramePr>
+              <a:graphicFrameLocks xmlns:a="http://schemas.openxmlformats.org/drawingml/2006/main" noChangeAspect="1"/>
+            </wp:cNvGraphicFramePr>
+            <a:graphic xmlns:a="http://schemas.openxmlformats.org/drawingml/2006/main">
+              <a:graphicData uri="http://schemas.openxmlformats.org/drawingml/2006/picture">
+                <pic:pic xmlns:pic="http://schemas.openxmlformats.org/drawingml/2006/picture">
+                  <pic:nvPicPr>
+                    <pic:cNvPr id="854151152" name="Picture 854151152"/>
+                    <pic:cNvPicPr/>
+                  </pic:nvPicPr>
+                  <pic:blipFill>
+                    <a:blip r:embed="rId10">
+                      <a:extLst>
+                        <a:ext uri="{28A0092B-C50C-407E-A947-70E740481C1C}">
+                          <a14:useLocalDpi xmlns:a14="http://schemas.microsoft.com/office/drawing/2010/main" val="0"/>
+                        </a:ext>
+                      </a:extLst>
+                    </a:blip>
+                    <a:stretch>
+                      <a:fillRect/>
+                    </a:stretch>
+                  </pic:blipFill>
+                  <pic:spPr>
+                    <a:xfrm>
+                      <a:off x="0" y="0"/>
+                      <a:ext cx="6120130" cy="2874645"/>
+                    </a:xfrm>
+                    <a:prstGeom prst="rect">
+                      <a:avLst/>
+                    </a:prstGeom>
+                  </pic:spPr>
+                </pic:pic>
+              </a:graphicData>
+            </a:graphic>
+          </wp:inline>
+        </w:drawing>
+      </w:r>
     </w:p>
     <w:p>
       <w:pPr>
         <w:pStyle w:val="Heading2"/>
+        <w:rPr>
+          <w:lang w:val="vi-VN"/>
+        </w:rPr>
       </w:pPr>
       <w:r>
         <w:t>4.4. Tìm kiếm, cập nhật và xóa</w:t>
@@ -2519,29 +2749,445 @@
     </w:p>
     <w:p>
       <w:pPr>
-        <w:pBdr>
-          <w:top w:val="single" w:sz="4" w:space="0" w:color="000000"/>
-          <w:left w:val="single" w:sz="4" w:space="0" w:color="000000"/>
-          <w:bottom w:val="single" w:sz="4" w:space="0" w:color="000000"/>
-          <w:right w:val="single" w:sz="4" w:space="0" w:color="000000"/>
-        </w:pBdr>
-        <w:spacing w:before="120" w:after="120"/>
-        <w:jc w:val="center"/>
-      </w:pPr>
-      <w:r>
-        <w:rPr>
-          <w:i/>
-          <w:iCs/>
-          <w:sz w:val="24"/>
-          <w:szCs w:val="24"/>
-        </w:rPr>
-        <w:t>[Chèn ảnh chụp màn hình: tim-kiem-cap-nhat.png]</w:t>
+        <w:rPr>
+          <w:lang w:val="vi-VN"/>
+        </w:rPr>
+      </w:pPr>
+      <w:r>
+        <w:rPr>
+          <w:lang w:val="vi-VN"/>
+        </w:rPr>
+        <w:t>a) Tìm kiếm</w:t>
       </w:r>
     </w:p>
     <w:p>
       <w:pPr>
         <w:spacing w:after="240"/>
-      </w:pPr>
+        <w:rPr>
+          <w:lang w:val="vi-VN"/>
+        </w:rPr>
+      </w:pPr>
+      <w:r>
+        <w:rPr>
+          <w:noProof/>
+        </w:rPr>
+        <w:drawing>
+          <wp:inline distT="0" distB="0" distL="0" distR="0" wp14:anchorId="0D2C2E69" wp14:editId="63E1D694">
+            <wp:extent cx="5969000" cy="2757829"/>
+            <wp:effectExtent l="0" t="0" r="0" b="4445"/>
+            <wp:docPr id="1664545470" name="Picture 6"/>
+            <wp:cNvGraphicFramePr>
+              <a:graphicFrameLocks xmlns:a="http://schemas.openxmlformats.org/drawingml/2006/main" noChangeAspect="1"/>
+            </wp:cNvGraphicFramePr>
+            <a:graphic xmlns:a="http://schemas.openxmlformats.org/drawingml/2006/main">
+              <a:graphicData uri="http://schemas.openxmlformats.org/drawingml/2006/picture">
+                <pic:pic xmlns:pic="http://schemas.openxmlformats.org/drawingml/2006/picture">
+                  <pic:nvPicPr>
+                    <pic:cNvPr id="1664545470" name="Picture 1664545470"/>
+                    <pic:cNvPicPr/>
+                  </pic:nvPicPr>
+                  <pic:blipFill>
+                    <a:blip r:embed="rId11">
+                      <a:extLst>
+                        <a:ext uri="{28A0092B-C50C-407E-A947-70E740481C1C}">
+                          <a14:useLocalDpi xmlns:a14="http://schemas.microsoft.com/office/drawing/2010/main" val="0"/>
+                        </a:ext>
+                      </a:extLst>
+                    </a:blip>
+                    <a:stretch>
+                      <a:fillRect/>
+                    </a:stretch>
+                  </pic:blipFill>
+                  <pic:spPr>
+                    <a:xfrm>
+                      <a:off x="0" y="0"/>
+                      <a:ext cx="5990674" cy="2767843"/>
+                    </a:xfrm>
+                    <a:prstGeom prst="rect">
+                      <a:avLst/>
+                    </a:prstGeom>
+                  </pic:spPr>
+                </pic:pic>
+              </a:graphicData>
+            </a:graphic>
+          </wp:inline>
+        </w:drawing>
+      </w:r>
+    </w:p>
+    <w:p>
+      <w:pPr>
+        <w:spacing w:after="240"/>
+        <w:rPr>
+          <w:lang w:val="vi-VN"/>
+        </w:rPr>
+      </w:pPr>
+      <w:r>
+        <w:rPr>
+          <w:noProof/>
+          <w:lang w:val="vi-VN"/>
+        </w:rPr>
+        <w:drawing>
+          <wp:inline distT="0" distB="0" distL="0" distR="0" wp14:anchorId="3B7F2013" wp14:editId="735E9A00">
+            <wp:extent cx="5918200" cy="2715937"/>
+            <wp:effectExtent l="0" t="0" r="6350" b="8255"/>
+            <wp:docPr id="1059083575" name="Picture 7"/>
+            <wp:cNvGraphicFramePr>
+              <a:graphicFrameLocks xmlns:a="http://schemas.openxmlformats.org/drawingml/2006/main" noChangeAspect="1"/>
+            </wp:cNvGraphicFramePr>
+            <a:graphic xmlns:a="http://schemas.openxmlformats.org/drawingml/2006/main">
+              <a:graphicData uri="http://schemas.openxmlformats.org/drawingml/2006/picture">
+                <pic:pic xmlns:pic="http://schemas.openxmlformats.org/drawingml/2006/picture">
+                  <pic:nvPicPr>
+                    <pic:cNvPr id="1059083575" name="Picture 1059083575"/>
+                    <pic:cNvPicPr/>
+                  </pic:nvPicPr>
+                  <pic:blipFill>
+                    <a:blip r:embed="rId12">
+                      <a:extLst>
+                        <a:ext uri="{28A0092B-C50C-407E-A947-70E740481C1C}">
+                          <a14:useLocalDpi xmlns:a14="http://schemas.microsoft.com/office/drawing/2010/main" val="0"/>
+                        </a:ext>
+                      </a:extLst>
+                    </a:blip>
+                    <a:stretch>
+                      <a:fillRect/>
+                    </a:stretch>
+                  </pic:blipFill>
+                  <pic:spPr>
+                    <a:xfrm>
+                      <a:off x="0" y="0"/>
+                      <a:ext cx="5923866" cy="2718537"/>
+                    </a:xfrm>
+                    <a:prstGeom prst="rect">
+                      <a:avLst/>
+                    </a:prstGeom>
+                  </pic:spPr>
+                </pic:pic>
+              </a:graphicData>
+            </a:graphic>
+          </wp:inline>
+        </w:drawing>
+      </w:r>
+    </w:p>
+    <w:p>
+      <w:pPr>
+        <w:spacing w:after="240"/>
+        <w:rPr>
+          <w:lang w:val="vi-VN"/>
+        </w:rPr>
+      </w:pPr>
+      <w:r>
+        <w:rPr>
+          <w:lang w:val="vi-VN"/>
+        </w:rPr>
+        <w:lastRenderedPageBreak/>
+        <w:t>b) Cập nhật</w:t>
+      </w:r>
+    </w:p>
+    <w:p>
+      <w:pPr>
+        <w:spacing w:after="240"/>
+        <w:rPr>
+          <w:lang w:val="vi-VN"/>
+        </w:rPr>
+      </w:pPr>
+      <w:r>
+        <w:rPr>
+          <w:noProof/>
+          <w:lang w:val="vi-VN"/>
+        </w:rPr>
+        <w:drawing>
+          <wp:inline distT="0" distB="0" distL="0" distR="0" wp14:anchorId="63DC77B7" wp14:editId="6C65A6AB">
+            <wp:extent cx="4426177" cy="3511730"/>
+            <wp:effectExtent l="0" t="0" r="0" b="0"/>
+            <wp:docPr id="236457471" name="Picture 8"/>
+            <wp:cNvGraphicFramePr>
+              <a:graphicFrameLocks xmlns:a="http://schemas.openxmlformats.org/drawingml/2006/main" noChangeAspect="1"/>
+            </wp:cNvGraphicFramePr>
+            <a:graphic xmlns:a="http://schemas.openxmlformats.org/drawingml/2006/main">
+              <a:graphicData uri="http://schemas.openxmlformats.org/drawingml/2006/picture">
+                <pic:pic xmlns:pic="http://schemas.openxmlformats.org/drawingml/2006/picture">
+                  <pic:nvPicPr>
+                    <pic:cNvPr id="236457471" name="Picture 236457471"/>
+                    <pic:cNvPicPr/>
+                  </pic:nvPicPr>
+                  <pic:blipFill>
+                    <a:blip r:embed="rId13">
+                      <a:extLst>
+                        <a:ext uri="{28A0092B-C50C-407E-A947-70E740481C1C}">
+                          <a14:useLocalDpi xmlns:a14="http://schemas.microsoft.com/office/drawing/2010/main" val="0"/>
+                        </a:ext>
+                      </a:extLst>
+                    </a:blip>
+                    <a:stretch>
+                      <a:fillRect/>
+                    </a:stretch>
+                  </pic:blipFill>
+                  <pic:spPr>
+                    <a:xfrm>
+                      <a:off x="0" y="0"/>
+                      <a:ext cx="4426177" cy="3511730"/>
+                    </a:xfrm>
+                    <a:prstGeom prst="rect">
+                      <a:avLst/>
+                    </a:prstGeom>
+                  </pic:spPr>
+                </pic:pic>
+              </a:graphicData>
+            </a:graphic>
+          </wp:inline>
+        </w:drawing>
+      </w:r>
+    </w:p>
+    <w:p>
+      <w:pPr>
+        <w:spacing w:after="240"/>
+        <w:rPr>
+          <w:lang w:val="vi-VN"/>
+        </w:rPr>
+      </w:pPr>
+      <w:r>
+        <w:rPr>
+          <w:noProof/>
+          <w:lang w:val="vi-VN"/>
+        </w:rPr>
+        <w:drawing>
+          <wp:inline distT="0" distB="0" distL="0" distR="0" wp14:anchorId="471AE520" wp14:editId="6638206B">
+            <wp:extent cx="6120130" cy="3004185"/>
+            <wp:effectExtent l="0" t="0" r="0" b="5715"/>
+            <wp:docPr id="1325868198" name="Picture 9"/>
+            <wp:cNvGraphicFramePr>
+              <a:graphicFrameLocks xmlns:a="http://schemas.openxmlformats.org/drawingml/2006/main" noChangeAspect="1"/>
+            </wp:cNvGraphicFramePr>
+            <a:graphic xmlns:a="http://schemas.openxmlformats.org/drawingml/2006/main">
+              <a:graphicData uri="http://schemas.openxmlformats.org/drawingml/2006/picture">
+                <pic:pic xmlns:pic="http://schemas.openxmlformats.org/drawingml/2006/picture">
+                  <pic:nvPicPr>
+                    <pic:cNvPr id="1325868198" name="Picture 1325868198"/>
+                    <pic:cNvPicPr/>
+                  </pic:nvPicPr>
+                  <pic:blipFill>
+                    <a:blip r:embed="rId14">
+                      <a:extLst>
+                        <a:ext uri="{28A0092B-C50C-407E-A947-70E740481C1C}">
+                          <a14:useLocalDpi xmlns:a14="http://schemas.microsoft.com/office/drawing/2010/main" val="0"/>
+                        </a:ext>
+                      </a:extLst>
+                    </a:blip>
+                    <a:stretch>
+                      <a:fillRect/>
+                    </a:stretch>
+                  </pic:blipFill>
+                  <pic:spPr>
+                    <a:xfrm>
+                      <a:off x="0" y="0"/>
+                      <a:ext cx="6120130" cy="3004185"/>
+                    </a:xfrm>
+                    <a:prstGeom prst="rect">
+                      <a:avLst/>
+                    </a:prstGeom>
+                  </pic:spPr>
+                </pic:pic>
+              </a:graphicData>
+            </a:graphic>
+          </wp:inline>
+        </w:drawing>
+      </w:r>
+    </w:p>
+    <w:p>
+      <w:pPr>
+        <w:rPr>
+          <w:lang w:val="vi-VN"/>
+        </w:rPr>
+      </w:pPr>
+    </w:p>
+    <w:p>
+      <w:pPr>
+        <w:rPr>
+          <w:lang w:val="vi-VN"/>
+        </w:rPr>
+      </w:pPr>
+    </w:p>
+    <w:p>
+      <w:pPr>
+        <w:rPr>
+          <w:lang w:val="vi-VN"/>
+        </w:rPr>
+      </w:pPr>
+    </w:p>
+    <w:p>
+      <w:pPr>
+        <w:rPr>
+          <w:lang w:val="vi-VN"/>
+        </w:rPr>
+      </w:pPr>
+    </w:p>
+    <w:p>
+      <w:pPr>
+        <w:rPr>
+          <w:lang w:val="vi-VN"/>
+        </w:rPr>
+      </w:pPr>
+    </w:p>
+    <w:p>
+      <w:pPr>
+        <w:rPr>
+          <w:lang w:val="vi-VN"/>
+        </w:rPr>
+      </w:pPr>
+    </w:p>
+    <w:p>
+      <w:pPr>
+        <w:rPr>
+          <w:lang w:val="vi-VN"/>
+        </w:rPr>
+      </w:pPr>
+    </w:p>
+    <w:p>
+      <w:pPr>
+        <w:rPr>
+          <w:lang w:val="vi-VN"/>
+        </w:rPr>
+      </w:pPr>
+    </w:p>
+    <w:p>
+      <w:pPr>
+        <w:rPr>
+          <w:lang w:val="vi-VN"/>
+        </w:rPr>
+      </w:pPr>
+    </w:p>
+    <w:p>
+      <w:pPr>
+        <w:rPr>
+          <w:lang w:val="vi-VN"/>
+        </w:rPr>
+      </w:pPr>
+    </w:p>
+    <w:p>
+      <w:pPr>
+        <w:spacing w:after="240"/>
+        <w:rPr>
+          <w:lang w:val="vi-VN"/>
+        </w:rPr>
+      </w:pPr>
+      <w:r>
+        <w:rPr>
+          <w:lang w:val="vi-VN"/>
+        </w:rPr>
+        <w:lastRenderedPageBreak/>
+        <w:t>c) Xóa</w:t>
+      </w:r>
+    </w:p>
+    <w:p>
+      <w:pPr>
+        <w:spacing w:after="240"/>
+        <w:rPr>
+          <w:lang w:val="vi-VN"/>
+        </w:rPr>
+      </w:pPr>
+      <w:r>
+        <w:rPr>
+          <w:noProof/>
+          <w:lang w:val="vi-VN"/>
+        </w:rPr>
+        <w:drawing>
+          <wp:inline distT="0" distB="0" distL="0" distR="0" wp14:anchorId="3706345E" wp14:editId="05A1BAA4">
+            <wp:extent cx="3549832" cy="2857647"/>
+            <wp:effectExtent l="0" t="0" r="0" b="0"/>
+            <wp:docPr id="1728371455" name="Picture 10"/>
+            <wp:cNvGraphicFramePr>
+              <a:graphicFrameLocks xmlns:a="http://schemas.openxmlformats.org/drawingml/2006/main" noChangeAspect="1"/>
+            </wp:cNvGraphicFramePr>
+            <a:graphic xmlns:a="http://schemas.openxmlformats.org/drawingml/2006/main">
+              <a:graphicData uri="http://schemas.openxmlformats.org/drawingml/2006/picture">
+                <pic:pic xmlns:pic="http://schemas.openxmlformats.org/drawingml/2006/picture">
+                  <pic:nvPicPr>
+                    <pic:cNvPr id="1728371455" name="Picture 1728371455"/>
+                    <pic:cNvPicPr/>
+                  </pic:nvPicPr>
+                  <pic:blipFill>
+                    <a:blip r:embed="rId15">
+                      <a:extLst>
+                        <a:ext uri="{28A0092B-C50C-407E-A947-70E740481C1C}">
+                          <a14:useLocalDpi xmlns:a14="http://schemas.microsoft.com/office/drawing/2010/main" val="0"/>
+                        </a:ext>
+                      </a:extLst>
+                    </a:blip>
+                    <a:stretch>
+                      <a:fillRect/>
+                    </a:stretch>
+                  </pic:blipFill>
+                  <pic:spPr>
+                    <a:xfrm>
+                      <a:off x="0" y="0"/>
+                      <a:ext cx="3549832" cy="2857647"/>
+                    </a:xfrm>
+                    <a:prstGeom prst="rect">
+                      <a:avLst/>
+                    </a:prstGeom>
+                  </pic:spPr>
+                </pic:pic>
+              </a:graphicData>
+            </a:graphic>
+          </wp:inline>
+        </w:drawing>
+      </w:r>
+    </w:p>
+    <w:p>
+      <w:pPr>
+        <w:spacing w:after="240"/>
+        <w:rPr>
+          <w:lang w:val="vi-VN"/>
+        </w:rPr>
+      </w:pPr>
+      <w:r>
+        <w:rPr>
+          <w:noProof/>
+          <w:lang w:val="vi-VN"/>
+        </w:rPr>
+        <w:drawing>
+          <wp:inline distT="0" distB="0" distL="0" distR="0" wp14:anchorId="720E1404" wp14:editId="745280CD">
+            <wp:extent cx="6120130" cy="2799080"/>
+            <wp:effectExtent l="0" t="0" r="0" b="1270"/>
+            <wp:docPr id="1819389580" name="Picture 11"/>
+            <wp:cNvGraphicFramePr>
+              <a:graphicFrameLocks xmlns:a="http://schemas.openxmlformats.org/drawingml/2006/main" noChangeAspect="1"/>
+            </wp:cNvGraphicFramePr>
+            <a:graphic xmlns:a="http://schemas.openxmlformats.org/drawingml/2006/main">
+              <a:graphicData uri="http://schemas.openxmlformats.org/drawingml/2006/picture">
+                <pic:pic xmlns:pic="http://schemas.openxmlformats.org/drawingml/2006/picture">
+                  <pic:nvPicPr>
+                    <pic:cNvPr id="1819389580" name="Picture 1819389580"/>
+                    <pic:cNvPicPr/>
+                  </pic:nvPicPr>
+                  <pic:blipFill>
+                    <a:blip r:embed="rId16">
+                      <a:extLst>
+                        <a:ext uri="{28A0092B-C50C-407E-A947-70E740481C1C}">
+                          <a14:useLocalDpi xmlns:a14="http://schemas.microsoft.com/office/drawing/2010/main" val="0"/>
+                        </a:ext>
+                      </a:extLst>
+                    </a:blip>
+                    <a:stretch>
+                      <a:fillRect/>
+                    </a:stretch>
+                  </pic:blipFill>
+                  <pic:spPr>
+                    <a:xfrm>
+                      <a:off x="0" y="0"/>
+                      <a:ext cx="6120130" cy="2799080"/>
+                    </a:xfrm>
+                    <a:prstGeom prst="rect">
+                      <a:avLst/>
+                    </a:prstGeom>
+                  </pic:spPr>
+                </pic:pic>
+              </a:graphicData>
+            </a:graphic>
+          </wp:inline>
+        </w:drawing>
+      </w:r>
     </w:p>
     <w:sectPr>
       <w:pgSz w:w="11906" w:h="16838"/>
@@ -2551,6 +3197,44 @@
     </w:sectPr>
   </w:body>
 </w:document>
+</file>
+
+<file path=word/endnotes.xml><?xml version="1.0" encoding="utf-8"?>
+<w:endnotes xmlns:wpc="http://schemas.microsoft.com/office/word/2010/wordprocessingCanvas" xmlns:cx="http://schemas.microsoft.com/office/drawing/2014/chartex" xmlns:cx1="http://schemas.microsoft.com/office/drawing/2015/9/8/chartex" xmlns:cx2="http://schemas.microsoft.com/office/drawing/2015/10/21/chartex" xmlns:cx3="http://schemas.microsoft.com/office/drawing/2016/5/9/chartex" xmlns:cx4="http://schemas.microsoft.com/office/drawing/2016/5/10/chartex" xmlns:cx5="http://schemas.microsoft.com/office/drawing/2016/5/11/chartex" xmlns:cx6="http://schemas.microsoft.com/office/drawing/2016/5/12/chartex" xmlns:cx7="http://schemas.microsoft.com/office/drawing/2016/5/13/chartex" xmlns:cx8="http://schemas.microsoft.com/office/drawing/2016/5/14/chartex" xmlns:mc="http://schemas.openxmlformats.org/markup-compatibility/2006" xmlns:aink="http://schemas.microsoft.com/office/drawing/2016/ink" xmlns:am3d="http://schemas.microsoft.com/office/drawing/2017/model3d" xmlns:o="urn:schemas-microsoft-com:office:office" xmlns:oel="http://schemas.microsoft.com/office/2019/extlst" xmlns:r="http://schemas.openxmlformats.org/officeDocument/2006/relationships" xmlns:m="http://schemas.openxmlformats.org/officeDocument/2006/math" xmlns:v="urn:schemas-microsoft-com:vml" xmlns:wp14="http://schemas.microsoft.com/office/word/2010/wordprocessingDrawing" xmlns:wp="http://schemas.openxmlformats.org/drawingml/2006/wordprocessingDrawing" xmlns:w10="urn:schemas-microsoft-com:office:word" xmlns:w="http://schemas.openxmlformats.org/wordprocessingml/2006/main" xmlns:w14="http://schemas.microsoft.com/office/word/2010/wordml" xmlns:w15="http://schemas.microsoft.com/office/word/2012/wordml" xmlns:w16cex="http://schemas.microsoft.com/office/word/2018/wordml/cex" xmlns:w16cid="http://schemas.microsoft.com/office/word/2016/wordml/cid" xmlns:w16="http://schemas.microsoft.com/office/word/2018/wordml" xmlns:w16du="http://schemas.microsoft.com/office/word/2023/wordml/word16du" xmlns:w16sdtdh="http://schemas.microsoft.com/office/word/2020/wordml/sdtdatahash" xmlns:w16sdtfl="http://schemas.microsoft.com/office/word/2024/wordml/sdtformatlock" xmlns:w16se="http://schemas.microsoft.com/office/word/2015/wordml/symex" xmlns:wpg="http://schemas.microsoft.com/office/word/2010/wordprocessingGroup" xmlns:wpi="http://schemas.microsoft.com/office/word/2010/wordprocessingInk" xmlns:wne="http://schemas.microsoft.com/office/word/2006/wordml" xmlns:wps="http://schemas.microsoft.com/office/word/2010/wordprocessingShape" mc:Ignorable="w14 w15 w16se w16cid w16 w16cex w16sdtdh w16sdtfl w16du wp14">
+  <w:endnote w:type="separator" w:id="-1">
+    <w:p>
+      <w:r>
+        <w:separator/>
+      </w:r>
+    </w:p>
+  </w:endnote>
+  <w:endnote w:type="continuationSeparator" w:id="0">
+    <w:p>
+      <w:r>
+        <w:continuationSeparator/>
+      </w:r>
+    </w:p>
+  </w:endnote>
+</w:endnotes>
+</file>
+
+<file path=word/footnotes.xml><?xml version="1.0" encoding="utf-8"?>
+<w:footnotes xmlns:wpc="http://schemas.microsoft.com/office/word/2010/wordprocessingCanvas" xmlns:cx="http://schemas.microsoft.com/office/drawing/2014/chartex" xmlns:cx1="http://schemas.microsoft.com/office/drawing/2015/9/8/chartex" xmlns:cx2="http://schemas.microsoft.com/office/drawing/2015/10/21/chartex" xmlns:cx3="http://schemas.microsoft.com/office/drawing/2016/5/9/chartex" xmlns:cx4="http://schemas.microsoft.com/office/drawing/2016/5/10/chartex" xmlns:cx5="http://schemas.microsoft.com/office/drawing/2016/5/11/chartex" xmlns:cx6="http://schemas.microsoft.com/office/drawing/2016/5/12/chartex" xmlns:cx7="http://schemas.microsoft.com/office/drawing/2016/5/13/chartex" xmlns:cx8="http://schemas.microsoft.com/office/drawing/2016/5/14/chartex" xmlns:mc="http://schemas.openxmlformats.org/markup-compatibility/2006" xmlns:aink="http://schemas.microsoft.com/office/drawing/2016/ink" xmlns:am3d="http://schemas.microsoft.com/office/drawing/2017/model3d" xmlns:o="urn:schemas-microsoft-com:office:office" xmlns:oel="http://schemas.microsoft.com/office/2019/extlst" xmlns:r="http://schemas.openxmlformats.org/officeDocument/2006/relationships" xmlns:m="http://schemas.openxmlformats.org/officeDocument/2006/math" xmlns:v="urn:schemas-microsoft-com:vml" xmlns:wp14="http://schemas.microsoft.com/office/word/2010/wordprocessingDrawing" xmlns:wp="http://schemas.openxmlformats.org/drawingml/2006/wordprocessingDrawing" xmlns:w10="urn:schemas-microsoft-com:office:word" xmlns:w="http://schemas.openxmlformats.org/wordprocessingml/2006/main" xmlns:w14="http://schemas.microsoft.com/office/word/2010/wordml" xmlns:w15="http://schemas.microsoft.com/office/word/2012/wordml" xmlns:w16cex="http://schemas.microsoft.com/office/word/2018/wordml/cex" xmlns:w16cid="http://schemas.microsoft.com/office/word/2016/wordml/cid" xmlns:w16="http://schemas.microsoft.com/office/word/2018/wordml" xmlns:w16du="http://schemas.microsoft.com/office/word/2023/wordml/word16du" xmlns:w16sdtdh="http://schemas.microsoft.com/office/word/2020/wordml/sdtdatahash" xmlns:w16sdtfl="http://schemas.microsoft.com/office/word/2024/wordml/sdtformatlock" xmlns:w16se="http://schemas.microsoft.com/office/word/2015/wordml/symex" xmlns:wpg="http://schemas.microsoft.com/office/word/2010/wordprocessingGroup" xmlns:wpi="http://schemas.microsoft.com/office/word/2010/wordprocessingInk" xmlns:wne="http://schemas.microsoft.com/office/word/2006/wordml" xmlns:wps="http://schemas.microsoft.com/office/word/2010/wordprocessingShape" mc:Ignorable="w14 w15 w16se w16cid w16 w16cex w16sdtdh w16sdtfl w16du wp14">
+  <w:footnote w:type="separator" w:id="-1">
+    <w:p>
+      <w:r>
+        <w:separator/>
+      </w:r>
+    </w:p>
+  </w:footnote>
+  <w:footnote w:type="continuationSeparator" w:id="0">
+    <w:p>
+      <w:r>
+        <w:continuationSeparator/>
+      </w:r>
+    </w:p>
+  </w:footnote>
+</w:footnotes>
 </file>
 
 <file path=word/numbering.xml><?xml version="1.0" encoding="utf-8"?>
@@ -3464,6 +4148,48 @@
     <w:semiHidden/>
     <w:unhideWhenUsed/>
   </w:style>
+  <w:style w:type="paragraph" w:styleId="Header">
+    <w:name w:val="header"/>
+    <w:basedOn w:val="Normal"/>
+    <w:link w:val="HeaderChar"/>
+    <w:uiPriority w:val="99"/>
+    <w:unhideWhenUsed/>
+    <w:rsid w:val="00707B80"/>
+    <w:pPr>
+      <w:tabs>
+        <w:tab w:val="center" w:pos="4680"/>
+        <w:tab w:val="right" w:pos="9360"/>
+      </w:tabs>
+    </w:pPr>
+  </w:style>
+  <w:style w:type="character" w:customStyle="1" w:styleId="HeaderChar">
+    <w:name w:val="Header Char"/>
+    <w:basedOn w:val="DefaultParagraphFont"/>
+    <w:link w:val="Header"/>
+    <w:uiPriority w:val="99"/>
+    <w:rsid w:val="00707B80"/>
+  </w:style>
+  <w:style w:type="paragraph" w:styleId="Footer">
+    <w:name w:val="footer"/>
+    <w:basedOn w:val="Normal"/>
+    <w:link w:val="FooterChar"/>
+    <w:uiPriority w:val="99"/>
+    <w:unhideWhenUsed/>
+    <w:rsid w:val="00707B80"/>
+    <w:pPr>
+      <w:tabs>
+        <w:tab w:val="center" w:pos="4680"/>
+        <w:tab w:val="right" w:pos="9360"/>
+      </w:tabs>
+    </w:pPr>
+  </w:style>
+  <w:style w:type="character" w:customStyle="1" w:styleId="FooterChar">
+    <w:name w:val="Footer Char"/>
+    <w:basedOn w:val="DefaultParagraphFont"/>
+    <w:link w:val="Footer"/>
+    <w:uiPriority w:val="99"/>
+    <w:rsid w:val="00707B80"/>
+  </w:style>
 </w:styles>
 </file>
 

</xml_diff>